<commit_message>
Team 1 Milestone 2 Updates
</commit_message>
<xml_diff>
--- a/03_Team_Work/Team1/Milestone_2_First_Dozen_Views/IC_Done/DC_M2_Team1_JobDetailView.docx
+++ b/03_Team_Work/Team1/Milestone_2_First_Dozen_Views/IC_Done/DC_M2_Team1_JobDetailView.docx
@@ -222,10 +222,10 @@
           <w14:ligatures w14:val="standardContextual"/>
         </w:rPr>
         <w:drawing>
-          <wp:inline distT="0" distB="0" distL="0" distR="0" wp14:anchorId="58D34BF3" wp14:editId="362CD004">
-            <wp:extent cx="3605842" cy="7647653"/>
-            <wp:effectExtent l="0" t="0" r="0" b="0"/>
-            <wp:docPr id="203882996" name="Picture 2"/>
+          <wp:inline distT="0" distB="0" distL="0" distR="0" wp14:anchorId="4EE3258D" wp14:editId="07661376">
+            <wp:extent cx="3597215" cy="7629722"/>
+            <wp:effectExtent l="0" t="0" r="3810" b="0"/>
+            <wp:docPr id="1002405793" name="Picture 1"/>
             <wp:cNvGraphicFramePr>
               <a:graphicFrameLocks xmlns:a="http://schemas.openxmlformats.org/drawingml/2006/main" noChangeAspect="1"/>
             </wp:cNvGraphicFramePr>
@@ -233,8 +233,10 @@
               <a:graphicData uri="http://schemas.openxmlformats.org/drawingml/2006/picture">
                 <pic:pic xmlns:pic="http://schemas.openxmlformats.org/drawingml/2006/picture">
                   <pic:nvPicPr>
-                    <pic:cNvPr id="203882996" name="Picture 203882996"/>
-                    <pic:cNvPicPr/>
+                    <pic:cNvPr id="0" name="Picture 1"/>
+                    <pic:cNvPicPr>
+                      <a:picLocks noChangeAspect="1" noChangeArrowheads="1"/>
+                    </pic:cNvPicPr>
                   </pic:nvPicPr>
                   <pic:blipFill>
                     <a:blip r:embed="rId6">
@@ -244,18 +246,23 @@
                         </a:ext>
                       </a:extLst>
                     </a:blip>
+                    <a:srcRect/>
                     <a:stretch>
                       <a:fillRect/>
                     </a:stretch>
                   </pic:blipFill>
-                  <pic:spPr>
+                  <pic:spPr bwMode="auto">
                     <a:xfrm>
                       <a:off x="0" y="0"/>
-                      <a:ext cx="3670991" cy="7785827"/>
+                      <a:ext cx="3614263" cy="7665880"/>
                     </a:xfrm>
                     <a:prstGeom prst="rect">
                       <a:avLst/>
                     </a:prstGeom>
+                    <a:noFill/>
+                    <a:ln>
+                      <a:noFill/>
+                    </a:ln>
                   </pic:spPr>
                 </pic:pic>
               </a:graphicData>
@@ -506,23 +513,13 @@
                 <w:lang w:eastAsia="en-US"/>
               </w:rPr>
             </w:pPr>
-            <w:proofErr w:type="gramStart"/>
-            <w:r>
-              <w:rPr>
-                <w:rFonts w:ascii="Arial" w:eastAsia="Times New Roman" w:hAnsi="Arial" w:cs="Arial"/>
-                <w:sz w:val="22"/>
-                <w:lang w:eastAsia="en-US"/>
-              </w:rPr>
-              <w:t>Allows</w:t>
-            </w:r>
-            <w:proofErr w:type="gramEnd"/>
-            <w:r>
-              <w:rPr>
-                <w:rFonts w:ascii="Arial" w:eastAsia="Times New Roman" w:hAnsi="Arial" w:cs="Arial"/>
-                <w:sz w:val="22"/>
-                <w:lang w:eastAsia="en-US"/>
-              </w:rPr>
-              <w:t xml:space="preserve"> students to </w:t>
+            <w:r>
+              <w:rPr>
+                <w:rFonts w:ascii="Arial" w:eastAsia="Times New Roman" w:hAnsi="Arial" w:cs="Arial"/>
+                <w:sz w:val="22"/>
+                <w:lang w:eastAsia="en-US"/>
+              </w:rPr>
+              <w:t xml:space="preserve">Allows students to </w:t>
             </w:r>
             <w:r>
               <w:rPr>

</xml_diff>